<commit_message>
Add native Windows app with automatic local network discovery
</commit_message>
<xml_diff>
--- a/docs/downloads/防封指南_保姆联动版.docx
+++ b/docs/downloads/防封指南_保姆联动版.docx
@@ -28,7 +28,7 @@
     </w:p>
     <w:p>
       <w:r>
-        <w:t>版本 2026.10.28-r2  |  更新日期 2026 年 10 月 28 日</w:t>
+        <w:t>版本 2026.10.28-r3  |  更新日期 2026 年 10 月 28 日</w:t>
       </w:r>
     </w:p>
     <w:p>
@@ -164,7 +164,7 @@
         <w:fldChar w:fldCharType="begin"/>
       </w:r>
       <w:r>
-        <w:instrText xml:space="preserve"> HYPERLINK \l _Toc6088 </w:instrText>
+        <w:instrText xml:space="preserve"> HYPERLINK \l _Toc12723 </w:instrText>
       </w:r>
       <w:r>
         <w:fldChar w:fldCharType="separate"/>
@@ -179,7 +179,7 @@
         <w:fldChar w:fldCharType="begin"/>
       </w:r>
       <w:r>
-        <w:instrText xml:space="preserve"> PAGEREF _Toc6088 \h </w:instrText>
+        <w:instrText xml:space="preserve"> PAGEREF _Toc12723 \h </w:instrText>
       </w:r>
       <w:r>
         <w:fldChar w:fldCharType="separate"/>
@@ -205,7 +205,7 @@
         <w:fldChar w:fldCharType="begin"/>
       </w:r>
       <w:r>
-        <w:instrText xml:space="preserve"> HYPERLINK \l _Toc8861 </w:instrText>
+        <w:instrText xml:space="preserve"> HYPERLINK \l _Toc26135 </w:instrText>
       </w:r>
       <w:r>
         <w:fldChar w:fldCharType="separate"/>
@@ -220,7 +220,7 @@
         <w:fldChar w:fldCharType="begin"/>
       </w:r>
       <w:r>
-        <w:instrText xml:space="preserve"> PAGEREF _Toc8861 \h </w:instrText>
+        <w:instrText xml:space="preserve"> PAGEREF _Toc26135 \h </w:instrText>
       </w:r>
       <w:r>
         <w:fldChar w:fldCharType="separate"/>
@@ -246,7 +246,7 @@
         <w:fldChar w:fldCharType="begin"/>
       </w:r>
       <w:r>
-        <w:instrText xml:space="preserve"> HYPERLINK \l _Toc9974 </w:instrText>
+        <w:instrText xml:space="preserve"> HYPERLINK \l _Toc3027 </w:instrText>
       </w:r>
       <w:r>
         <w:fldChar w:fldCharType="separate"/>
@@ -261,7 +261,7 @@
         <w:fldChar w:fldCharType="begin"/>
       </w:r>
       <w:r>
-        <w:instrText xml:space="preserve"> PAGEREF _Toc9974 \h </w:instrText>
+        <w:instrText xml:space="preserve"> PAGEREF _Toc3027 \h </w:instrText>
       </w:r>
       <w:r>
         <w:fldChar w:fldCharType="separate"/>
@@ -287,7 +287,7 @@
         <w:fldChar w:fldCharType="begin"/>
       </w:r>
       <w:r>
-        <w:instrText xml:space="preserve"> HYPERLINK \l _Toc24334 </w:instrText>
+        <w:instrText xml:space="preserve"> HYPERLINK \l _Toc31131 </w:instrText>
       </w:r>
       <w:r>
         <w:fldChar w:fldCharType="separate"/>
@@ -302,7 +302,7 @@
         <w:fldChar w:fldCharType="begin"/>
       </w:r>
       <w:r>
-        <w:instrText xml:space="preserve"> PAGEREF _Toc24334 \h </w:instrText>
+        <w:instrText xml:space="preserve"> PAGEREF _Toc31131 \h </w:instrText>
       </w:r>
       <w:r>
         <w:fldChar w:fldCharType="separate"/>
@@ -328,7 +328,7 @@
         <w:fldChar w:fldCharType="begin"/>
       </w:r>
       <w:r>
-        <w:instrText xml:space="preserve"> HYPERLINK \l _Toc3146 </w:instrText>
+        <w:instrText xml:space="preserve"> HYPERLINK \l _Toc23609 </w:instrText>
       </w:r>
       <w:r>
         <w:fldChar w:fldCharType="separate"/>
@@ -343,7 +343,7 @@
         <w:fldChar w:fldCharType="begin"/>
       </w:r>
       <w:r>
-        <w:instrText xml:space="preserve"> PAGEREF _Toc3146 \h </w:instrText>
+        <w:instrText xml:space="preserve"> PAGEREF _Toc23609 \h </w:instrText>
       </w:r>
       <w:r>
         <w:fldChar w:fldCharType="separate"/>
@@ -369,7 +369,7 @@
         <w:fldChar w:fldCharType="begin"/>
       </w:r>
       <w:r>
-        <w:instrText xml:space="preserve"> HYPERLINK \l _Toc21822 </w:instrText>
+        <w:instrText xml:space="preserve"> HYPERLINK \l _Toc5545 </w:instrText>
       </w:r>
       <w:r>
         <w:fldChar w:fldCharType="separate"/>
@@ -384,7 +384,7 @@
         <w:fldChar w:fldCharType="begin"/>
       </w:r>
       <w:r>
-        <w:instrText xml:space="preserve"> PAGEREF _Toc21822 \h </w:instrText>
+        <w:instrText xml:space="preserve"> PAGEREF _Toc5545 \h </w:instrText>
       </w:r>
       <w:r>
         <w:fldChar w:fldCharType="separate"/>
@@ -410,7 +410,7 @@
         <w:fldChar w:fldCharType="begin"/>
       </w:r>
       <w:r>
-        <w:instrText xml:space="preserve"> HYPERLINK \l _Toc21720 </w:instrText>
+        <w:instrText xml:space="preserve"> HYPERLINK \l _Toc21996 </w:instrText>
       </w:r>
       <w:r>
         <w:fldChar w:fldCharType="separate"/>
@@ -425,7 +425,7 @@
         <w:fldChar w:fldCharType="begin"/>
       </w:r>
       <w:r>
-        <w:instrText xml:space="preserve"> PAGEREF _Toc21720 \h </w:instrText>
+        <w:instrText xml:space="preserve"> PAGEREF _Toc21996 \h </w:instrText>
       </w:r>
       <w:r>
         <w:fldChar w:fldCharType="separate"/>
@@ -451,13 +451,13 @@
         <w:fldChar w:fldCharType="begin"/>
       </w:r>
       <w:r>
-        <w:instrText xml:space="preserve"> HYPERLINK \l _Toc8535 </w:instrText>
+        <w:instrText xml:space="preserve"> HYPERLINK \l _Toc24088 </w:instrText>
       </w:r>
       <w:r>
         <w:fldChar w:fldCharType="separate"/>
       </w:r>
       <w:r>
-        <w:t>第八章 下载并启动本地检测工作台</w:t>
+        <w:t>第八章 双击本地程序 直接看检测结果</w:t>
       </w:r>
       <w:r>
         <w:tab/>
@@ -466,7 +466,7 @@
         <w:fldChar w:fldCharType="begin"/>
       </w:r>
       <w:r>
-        <w:instrText xml:space="preserve"> PAGEREF _Toc8535 \h </w:instrText>
+        <w:instrText xml:space="preserve"> PAGEREF _Toc24088 \h </w:instrText>
       </w:r>
       <w:r>
         <w:fldChar w:fldCharType="separate"/>
@@ -492,7 +492,7 @@
         <w:fldChar w:fldCharType="begin"/>
       </w:r>
       <w:r>
-        <w:instrText xml:space="preserve"> HYPERLINK \l _Toc2537 </w:instrText>
+        <w:instrText xml:space="preserve"> HYPERLINK \l _Toc32424 </w:instrText>
       </w:r>
       <w:r>
         <w:fldChar w:fldCharType="separate"/>
@@ -507,7 +507,7 @@
         <w:fldChar w:fldCharType="begin"/>
       </w:r>
       <w:r>
-        <w:instrText xml:space="preserve"> PAGEREF _Toc2537 \h </w:instrText>
+        <w:instrText xml:space="preserve"> PAGEREF _Toc32424 \h </w:instrText>
       </w:r>
       <w:r>
         <w:fldChar w:fldCharType="separate"/>
@@ -533,7 +533,7 @@
         <w:fldChar w:fldCharType="begin"/>
       </w:r>
       <w:r>
-        <w:instrText xml:space="preserve"> HYPERLINK \l _Toc5687 </w:instrText>
+        <w:instrText xml:space="preserve"> HYPERLINK \l _Toc30190 </w:instrText>
       </w:r>
       <w:r>
         <w:fldChar w:fldCharType="separate"/>
@@ -548,7 +548,7 @@
         <w:fldChar w:fldCharType="begin"/>
       </w:r>
       <w:r>
-        <w:instrText xml:space="preserve"> PAGEREF _Toc5687 \h </w:instrText>
+        <w:instrText xml:space="preserve"> PAGEREF _Toc30190 \h </w:instrText>
       </w:r>
       <w:r>
         <w:fldChar w:fldCharType="separate"/>
@@ -574,7 +574,7 @@
         <w:fldChar w:fldCharType="begin"/>
       </w:r>
       <w:r>
-        <w:instrText xml:space="preserve"> HYPERLINK \l _Toc20140 </w:instrText>
+        <w:instrText xml:space="preserve"> HYPERLINK \l _Toc14507 </w:instrText>
       </w:r>
       <w:r>
         <w:fldChar w:fldCharType="separate"/>
@@ -589,7 +589,7 @@
         <w:fldChar w:fldCharType="begin"/>
       </w:r>
       <w:r>
-        <w:instrText xml:space="preserve"> PAGEREF _Toc20140 \h </w:instrText>
+        <w:instrText xml:space="preserve"> PAGEREF _Toc14507 \h </w:instrText>
       </w:r>
       <w:r>
         <w:fldChar w:fldCharType="separate"/>
@@ -615,7 +615,7 @@
         <w:fldChar w:fldCharType="begin"/>
       </w:r>
       <w:r>
-        <w:instrText xml:space="preserve"> HYPERLINK \l _Toc16092 </w:instrText>
+        <w:instrText xml:space="preserve"> HYPERLINK \l _Toc7291 </w:instrText>
       </w:r>
       <w:r>
         <w:fldChar w:fldCharType="separate"/>
@@ -630,7 +630,7 @@
         <w:fldChar w:fldCharType="begin"/>
       </w:r>
       <w:r>
-        <w:instrText xml:space="preserve"> PAGEREF _Toc16092 \h </w:instrText>
+        <w:instrText xml:space="preserve"> PAGEREF _Toc7291 \h </w:instrText>
       </w:r>
       <w:r>
         <w:fldChar w:fldCharType="separate"/>
@@ -654,7 +654,7 @@
       <w:pPr>
         <w:pStyle w:val="3"/>
       </w:pPr>
-      <w:bookmarkStart w:id="0" w:name="_Toc6088"/>
+      <w:bookmarkStart w:id="0" w:name="_Toc12723"/>
       <w:r>
         <w:t>第一章 先知道这份指南怎么用</w:t>
       </w:r>
@@ -832,7 +832,7 @@
       <w:pPr>
         <w:pStyle w:val="3"/>
       </w:pPr>
-      <w:bookmarkStart w:id="1" w:name="_Toc8861"/>
+      <w:bookmarkStart w:id="1" w:name="_Toc26135"/>
       <w:r>
         <w:t>第二章 准备工具 认清几个常用词</w:t>
       </w:r>
@@ -973,16 +973,7 @@
     </w:p>
     <w:p>
       <w:r>
-        <w:t xml:space="preserve">代理客户端负责实际联网；本项目的“Claude 网络指南”工作台负责检测和启动前检查。两者不是同一个程序。工作台显示在浏览器里，并不表示你的配置上传到了某个网站；本地地址以 </w:t>
-      </w:r>
-      <w:r>
-        <w:rPr>
-          <w:rFonts w:ascii="Consolas" w:hAnsi="Consolas"/>
-        </w:rPr>
-        <w:t>127.0.0.1</w:t>
-      </w:r>
-      <w:r>
-        <w:t xml:space="preserve"> 开头，表示服务运行在自己的电脑上。</w:t>
+        <w:t>代理客户端负责实际联网；本项目的“Claude 本机体检”负责检测和启动前检查。两者不是同一个程序。Windows 便携版在独立窗口里运行，自动读取相关电脑配置并给出结果。维护者的源码版使用本地浏览器界面；两种方式的检测内核都在自己电脑上，没有云端报告后台。</w:t>
       </w:r>
     </w:p>
     <w:p>
@@ -1020,7 +1011,7 @@
       <w:pPr>
         <w:pStyle w:val="3"/>
       </w:pPr>
-      <w:bookmarkStart w:id="2" w:name="_Toc9974"/>
+      <w:bookmarkStart w:id="2" w:name="_Toc3027"/>
       <w:r>
         <w:t>第三章 先买 VPS 不要一开始就买错产品</w:t>
       </w:r>
@@ -1154,7 +1145,7 @@
       <w:pPr>
         <w:pStyle w:val="3"/>
       </w:pPr>
-      <w:bookmarkStart w:id="3" w:name="_Toc24334"/>
+      <w:bookmarkStart w:id="3" w:name="_Toc31131"/>
       <w:r>
         <w:t>第四章 自己购买固定独享住宅出口</w:t>
       </w:r>
@@ -1288,7 +1279,7 @@
       <w:pPr>
         <w:pStyle w:val="3"/>
       </w:pPr>
-      <w:bookmarkStart w:id="4" w:name="_Toc3146"/>
+      <w:bookmarkStart w:id="4" w:name="_Toc23609"/>
       <w:r>
         <w:t>第五章 把资料安全交接 确定线路怎么走</w:t>
       </w:r>
@@ -1448,7 +1439,7 @@
       <w:pPr>
         <w:pStyle w:val="3"/>
       </w:pPr>
-      <w:bookmarkStart w:id="5" w:name="_Toc21822"/>
+      <w:bookmarkStart w:id="5" w:name="_Toc5545"/>
       <w:r>
         <w:t>第六章 部署服务器 先做基础网络</w:t>
       </w:r>
@@ -1498,7 +1489,7 @@
     </w:p>
     <w:p>
       <w:r>
-        <w:t>使用本仓库的网络部署说明。先下载项目、检查现有脚本和当前机器，再开始。Windows 下远程部署脚本需要 Bash 环境，通常使用 WSL；这与第八章的本地工作台不同，后者只需要 Python。不知道是否已有 WSL 时先检查，不必为了打开检测页面安装一套 Linux。</w:t>
+        <w:t>使用本仓库的网络部署说明。先下载项目、检查现有脚本和当前机器，再开始。Windows 下远程部署脚本需要 Bash 环境，通常使用 WSL；这与第八章的本地工作台不同，后者可直接使用 Windows 便携程序。不知道是否已有 WSL 时先检查，不必为了打开检测页面安装一套 Linux。</w:t>
       </w:r>
     </w:p>
     <w:p>
@@ -1600,7 +1591,7 @@
       <w:pPr>
         <w:pStyle w:val="3"/>
       </w:pPr>
-      <w:bookmarkStart w:id="6" w:name="_Toc21720"/>
+      <w:bookmarkStart w:id="6" w:name="_Toc21996"/>
       <w:r>
         <w:t>第七章 在 Windows 上配置代理客户端</w:t>
       </w:r>
@@ -1842,9 +1833,9 @@
       <w:pPr>
         <w:pStyle w:val="3"/>
       </w:pPr>
-      <w:bookmarkStart w:id="7" w:name="_Toc8535"/>
-      <w:r>
-        <w:t>第八章 下载并启动本地检测工作台</w:t>
+      <w:bookmarkStart w:id="7" w:name="_Toc24088"/>
+      <w:r>
+        <w:t>第八章 双击本地程序 直接看检测结果</w:t>
       </w:r>
       <w:bookmarkEnd w:id="7"/>
     </w:p>
@@ -1882,7 +1873,7 @@
         <w:pStyle w:val="4"/>
       </w:pPr>
       <w:r>
-        <w:t>第一步 下载 ZIP 先解压再运行</w:t>
+        <w:t>第一步 下载 Windows 便携包</w:t>
       </w:r>
     </w:p>
     <w:p>
@@ -1893,7 +1884,7 @@
         <w:fldChar w:fldCharType="begin"/>
       </w:r>
       <w:r>
-        <w:instrText xml:space="preserve"> HYPERLINK "https://github.com/clm031102-source/claude-network-guide" \h </w:instrText>
+        <w:instrText xml:space="preserve"> HYPERLINK "https://github.com/clm031102-source/claude-network-guide/releases" \h </w:instrText>
       </w:r>
       <w:r>
         <w:fldChar w:fldCharType="separate"/>
@@ -1903,7 +1894,7 @@
           <w:color w:val="185B75"/>
           <w:u w:val="single"/>
         </w:rPr>
-        <w:t>公开仓库的代码首页</w:t>
+        <w:t>本项目程序下载页</w:t>
       </w:r>
       <w:r>
         <w:rPr>
@@ -1913,13 +1904,41 @@
         <w:fldChar w:fldCharType="end"/>
       </w:r>
       <w:r>
-        <w:t>，点击绿色的 Code，选择 Download ZIP，保存到自己的下载目录。下载完后，在资源管理器中对 ZIP 选择“全部解压缩”，将解压目录放到容易找到的位置。若从</w:t>
+        <w:t xml:space="preserve">，选择最新版本的 </w:t>
+      </w:r>
+      <w:r>
+        <w:rPr>
+          <w:rFonts w:ascii="Consolas" w:hAnsi="Consolas"/>
+        </w:rPr>
+        <w:t>ClaudeNetworkGuide-Windows-x64.zip</w:t>
+      </w:r>
+      <w:r>
+        <w:t>。这是已经打包好的 Windows 本地程序，普通使用者无需安装 Python，不要误选页面里的 Source code 源码压缩包。</w:t>
+      </w:r>
+    </w:p>
+    <w:p>
+      <w:r>
+        <w:t xml:space="preserve">下载完成后，在资源管理器中对 ZIP 选择“全部解压缩”，保存到方便找到的位置。不要在压缩包预览里直接运行，也不要只拿出 exe 而丢掉依赖文件夹。完整保留解压后的内容，双击 </w:t>
+      </w:r>
+      <w:r>
+        <w:rPr>
+          <w:rFonts w:ascii="Consolas" w:hAnsi="Consolas"/>
+        </w:rPr>
+        <w:t>ClaudeNetworkGuide.exe</w:t>
+      </w:r>
+      <w:r>
+        <w:t>。</w:t>
+      </w:r>
+    </w:p>
+    <w:p>
+      <w:r>
+        <w:t xml:space="preserve">程序使用 Windows 的 Microsoft Edge WebView2 显示独立窗口。若机器缺少它，按提示从 </w:t>
       </w:r>
       <w:r>
         <w:fldChar w:fldCharType="begin"/>
       </w:r>
       <w:r>
-        <w:instrText xml:space="preserve"> HYPERLINK "https://github.com/clm031102-source/claude-network-guide/blob/main/README.md" \h </w:instrText>
+        <w:instrText xml:space="preserve"> HYPERLINK "https://developer.microsoft.com/microsoft-edge/webview2/" \h </w:instrText>
       </w:r>
       <w:r>
         <w:fldChar w:fldCharType="separate"/>
@@ -1929,7 +1948,7 @@
           <w:color w:val="185B75"/>
           <w:u w:val="single"/>
         </w:rPr>
-        <w:t>项目说明</w:t>
+        <w:t>Microsoft 官方页面</w:t>
       </w:r>
       <w:r>
         <w:rPr>
@@ -1939,58 +1958,13 @@
         <w:fldChar w:fldCharType="end"/>
       </w:r>
       <w:r>
-        <w:t>进入，先回到仓库的代码首页再找 Code。</w:t>
-      </w:r>
-    </w:p>
-    <w:p>
-      <w:r>
-        <w:t xml:space="preserve">不要直接在压缩包预览窗口里双击脚本。打开解压后的文件夹，确认这一层同时能看见 </w:t>
-      </w:r>
-      <w:r>
-        <w:rPr>
-          <w:rFonts w:ascii="Consolas" w:hAnsi="Consolas"/>
-        </w:rPr>
-        <w:t>README.md</w:t>
-      </w:r>
-      <w:r>
-        <w:t>、</w:t>
-      </w:r>
-      <w:r>
-        <w:rPr>
-          <w:rFonts w:ascii="Consolas" w:hAnsi="Consolas"/>
-        </w:rPr>
-        <w:t>app</w:t>
-      </w:r>
-      <w:r>
-        <w:t xml:space="preserve"> 文件夹和 </w:t>
-      </w:r>
-      <w:r>
-        <w:rPr>
-          <w:rFonts w:ascii="Consolas" w:hAnsi="Consolas"/>
-        </w:rPr>
-        <w:t>启动检测.cmd</w:t>
-      </w:r>
-      <w:r>
-        <w:t>。如果外层只有一个同名文件夹，再进入一层。这个同时包含三者的位置就是项目根目录。</w:t>
-      </w:r>
-    </w:p>
-    <w:p>
-      <w:pPr>
-        <w:pStyle w:val="4"/>
-      </w:pPr>
-      <w:r>
-        <w:t>第二步 安装或检查 Python</w:t>
-      </w:r>
-    </w:p>
-    <w:p>
-      <w:r>
-        <w:t xml:space="preserve">Python 是运行工作台所需的程序环境，不要求你学习编程。已有 Python 3.10 或更新版本可以直接使用；没有时打开 </w:t>
+        <w:t>安装运行时，不需要关闭防护或寻找来历不明的补丁。完整打开说明见</w:t>
       </w:r>
       <w:r>
         <w:fldChar w:fldCharType="begin"/>
       </w:r>
       <w:r>
-        <w:instrText xml:space="preserve"> HYPERLINK "https://www.python.org/downloads/" \h </w:instrText>
+        <w:instrText xml:space="preserve"> HYPERLINK "https://github.com/clm031102-source/claude-network-guide/blob/main/docs/desktop-app.md" \h </w:instrText>
       </w:r>
       <w:r>
         <w:fldChar w:fldCharType="separate"/>
@@ -2000,7 +1974,7 @@
           <w:color w:val="185B75"/>
           <w:u w:val="single"/>
         </w:rPr>
-        <w:t>Python 官方下载页面</w:t>
+        <w:t>本地程序说明</w:t>
       </w:r>
       <w:r>
         <w:rPr>
@@ -2010,67 +1984,7 @@
         <w:fldChar w:fldCharType="end"/>
       </w:r>
       <w:r>
-        <w:t>，按当前 Windows 安装说明操作。官方可能先提供 Python 安装管理器，再安装实际运行时，跟随官方流程即可。</w:t>
-      </w:r>
-      <w:r>
-        <w:fldChar w:fldCharType="begin"/>
-      </w:r>
-      <w:r>
-        <w:instrText xml:space="preserve"> HYPERLINK "https://docs.python.org/3/using/windows.html" \h </w:instrText>
-      </w:r>
-      <w:r>
-        <w:fldChar w:fldCharType="separate"/>
-      </w:r>
-      <w:r>
-        <w:rPr>
-          <w:color w:val="185B75"/>
-          <w:u w:val="single"/>
-        </w:rPr>
-        <w:t>Python Windows 官方说明</w:t>
-      </w:r>
-      <w:r>
-        <w:rPr>
-          <w:color w:val="185B75"/>
-          <w:u w:val="single"/>
-        </w:rPr>
-        <w:fldChar w:fldCharType="end"/>
-      </w:r>
-    </w:p>
-    <w:p>
-      <w:r>
-        <w:t xml:space="preserve">安装完成后重新打开终端。可以在开始菜单搜索“终端”，输入 </w:t>
-      </w:r>
-      <w:r>
-        <w:rPr>
-          <w:rFonts w:ascii="Consolas" w:hAnsi="Consolas"/>
-        </w:rPr>
-        <w:t>py -3 --version</w:t>
-      </w:r>
-      <w:r>
-        <w:t xml:space="preserve"> 并回车；正常会显示 Python 3.x 的版本。若提示找不到 </w:t>
-      </w:r>
-      <w:r>
-        <w:rPr>
-          <w:rFonts w:ascii="Consolas" w:hAnsi="Consolas"/>
-        </w:rPr>
-        <w:t>py</w:t>
-      </w:r>
-      <w:r>
-        <w:t xml:space="preserve">，试 </w:t>
-      </w:r>
-      <w:r>
-        <w:rPr>
-          <w:rFonts w:ascii="Consolas" w:hAnsi="Consolas"/>
-        </w:rPr>
-        <w:t>python --version</w:t>
-      </w:r>
-      <w:r>
-        <w:t>；能显示满足要求的版本，启动脚本也能使用它。若新安装管理器提示尚未安装运行时，按官方提示安装稳定的 Python 3 后重试。不要因为命令失败就卸载电脑上所有 Python，其他软件可能正在使用它。</w:t>
-      </w:r>
-    </w:p>
-    <w:p>
-      <w:r>
-        <w:t>版本满足要求后关闭检查窗口。工作台使用 Python 标准库，不需要你再搜索几十个依赖包，也不用安装服务器部署用的 WSL。</w:t>
+        <w:t>。</w:t>
       </w:r>
     </w:p>
     <w:p>
@@ -2078,35 +1992,17 @@
         <w:pStyle w:val="4"/>
       </w:pPr>
       <w:r>
-        <w:t>第三步 打开工作台</w:t>
-      </w:r>
-    </w:p>
-    <w:p>
-      <w:r>
-        <w:t xml:space="preserve">回到项目根目录，双击 </w:t>
-      </w:r>
-      <w:r>
-        <w:rPr>
-          <w:rFonts w:ascii="Consolas" w:hAnsi="Consolas"/>
-        </w:rPr>
-        <w:t>启动检测.cmd</w:t>
-      </w:r>
-      <w:r>
-        <w:t xml:space="preserve">。会出现一个本地服务窗口，并显示实际访问地址；浏览器若没有自动打开，就复制该地址到地址栏。默认优先使用 </w:t>
-      </w:r>
-      <w:r>
-        <w:rPr>
-          <w:rFonts w:ascii="Consolas" w:hAnsi="Consolas"/>
-        </w:rPr>
-        <w:t>http://127.0.0.1:8765</w:t>
-      </w:r>
-      <w:r>
-        <w:t>，被占用时会尝试后续端口，直到 8774。以服务窗口实际输出为准，不反复硬输 8765。</w:t>
-      </w:r>
-    </w:p>
-    <w:p>
-      <w:r>
-        <w:t>这个窗口运行期间工作台才可访问。不要在页面刚打开时把它关闭；想停止工作台时再关掉服务窗口。程序不会为了占用端口而结束其他软件，也不需要把面板公开给局域网。</w:t>
+        <w:t>第二步 等程序自动读取本机配置</w:t>
+      </w:r>
+    </w:p>
+    <w:p>
+      <w:r>
+        <w:t>窗口名称是“Claude 本机体检”。打开后自动执行一次只读体检，先识别电脑的系统代理、代理进程和监听端口、活动网卡/TUN、路由、DNS、时区语言以及 Claude 安装位置，再实际测试网络出口和目标连接。你不用先回答一份问卷，也不用知道代理端口和安装路径。</w:t>
+      </w:r>
+    </w:p>
+    <w:p>
+      <w:r>
+        <w:t>程序和界面均在自己的电脑运行，不把配置上传到仓库维护者的云端。读取范围是相关网络和应用设置，不翻阅私人文档，不读取 Claude 登录态。公网出口与连通性测试会联系固定服务，对方能看到请求实际来源；检测不会替你修改网络或登录账号。</w:t>
       </w:r>
     </w:p>
     <w:p>
@@ -2160,12 +2056,7 @@
         <w:pStyle w:val="169"/>
       </w:pPr>
       <w:r>
-        <w:t>本地检测工作台</w:t>
-      </w:r>
-    </w:p>
-    <w:p>
-      <w:r>
-        <w:t>页面名称是“Claude 网络指南”，左侧按购买、配置、检测和设置组织。打开页面不会自动检测网络；点击检测或启动时才会联系固定测试服务。这些服务能看到请求实际来源，因此先理解线路结构，再运行测试。</w:t>
+        <w:t>Claude 本机体检界面示意</w:t>
       </w:r>
     </w:p>
     <w:p>
@@ -2173,41 +2064,28 @@
         <w:pStyle w:val="4"/>
       </w:pPr>
       <w:r>
-        <w:t>第四步 填写三个主要信息</w:t>
-      </w:r>
-    </w:p>
-    <w:p>
-      <w:r>
-        <w:t xml:space="preserve">进入“连接设置”。住宅 IPv4 填第四章确定的最终公网地址；普通 VPS 中转方案不能误填 VPS 机房 IP。代理地址填第七章找到的 HTTP 或混合端口，例如 </w:t>
-      </w:r>
-      <w:r>
-        <w:rPr>
-          <w:rFonts w:ascii="Consolas" w:hAnsi="Consolas"/>
-        </w:rPr>
-        <w:t>http://127.0.0.1:7897</w:t>
-      </w:r>
-      <w:r>
-        <w:t>；不要加入上游用户名和密码。</w:t>
-      </w:r>
-    </w:p>
-    <w:p>
-      <w:r>
-        <w:t xml:space="preserve">Claude 路径要指向已经安装的官方客户端，而不是下载好的安装包、桌面快捷方式，也不是名为 </w:t>
-      </w:r>
-      <w:r>
-        <w:rPr>
-          <w:rFonts w:ascii="Consolas" w:hAnsi="Consolas"/>
-        </w:rPr>
-        <w:t>claude</w:t>
-      </w:r>
-      <w:r>
-        <w:t xml:space="preserve"> 的命令行程序。官方客户端下载从 </w:t>
+        <w:t>第三步 看事实和结果 不先忙着填表</w:t>
+      </w:r>
+    </w:p>
+    <w:p>
+      <w:r>
+        <w:t>先看“本机识别”区域：当前代理来自哪里，实际读到哪些客户端和网卡，是否找到 Claude。再看逐项结果。绿色“已通过”表示相应测试拿到了有效证据；“需留意”是有事实依据的提醒；“未通过”表示实际发现问题；“未验证”表示权限、超时或实现范围导致证据不足。</w:t>
+      </w:r>
+    </w:p>
+    <w:p>
+      <w:r>
+        <w:t>没有填写住宅 IP，不会被当作网络失败。程序会先给出实测出口及不同通道是否一致；它不能靠读取电脑证明商家是否把 IP 独享给你。采购证明按第四章留存，程序不再要求勾选采购声明才能检测。</w:t>
+      </w:r>
+    </w:p>
+    <w:p>
+      <w:r>
+        <w:t>DNS、UDP 和 IPv6 需要分别看结果。fake-IP 不等于上游 DNS 无泄漏，STUN 没响应不等于 UDP 已阻断；网络查询超时应显示未验证，不能为了好看变绿。每项读取与测试的实际边界见</w:t>
       </w:r>
       <w:r>
         <w:fldChar w:fldCharType="begin"/>
       </w:r>
       <w:r>
-        <w:instrText xml:space="preserve"> HYPERLINK "https://support.claude.com/en/articles/10065433-install-claude-desktop" \h </w:instrText>
+        <w:instrText xml:space="preserve"> HYPERLINK "https://github.com/clm031102-source/claude-network-guide/blob/main/docs/04-preflight-check.md" \h </w:instrText>
       </w:r>
       <w:r>
         <w:fldChar w:fldCharType="separate"/>
@@ -2217,7 +2095,7 @@
           <w:color w:val="185B75"/>
           <w:u w:val="single"/>
         </w:rPr>
-        <w:t>Claude 安装说明</w:t>
+        <w:t>检测说明</w:t>
       </w:r>
       <w:r>
         <w:rPr>
@@ -2227,58 +2105,56 @@
         <w:fldChar w:fldCharType="end"/>
       </w:r>
       <w:r>
-        <w:t>进入，按自己的系统安装。安装结束若自动打开客户端，先正常退出，等检测配置完成再启动。</w:t>
-      </w:r>
-    </w:p>
-    <w:p>
-      <w:r>
-        <w:t xml:space="preserve">Windows 需要真实、完整的 </w:t>
+        <w:t>。</w:t>
+      </w:r>
+    </w:p>
+    <w:p>
+      <w:pPr>
+        <w:pStyle w:val="4"/>
+      </w:pPr>
+      <w:r>
+        <w:t>第四步 只有需要覆盖时才用高级设置</w:t>
+      </w:r>
+    </w:p>
+    <w:p>
+      <w:r>
+        <w:t>自动识别结果正常时，直接继续，不需要填写设置。你有特殊端口、安装位置或已经核验的目标出口时，才进入高级设置；代理地址、Claude 路径和预期 IP 都可留空，表示自动识别。</w:t>
+      </w:r>
+    </w:p>
+    <w:p>
+      <w:r>
+        <w:t>需要指定代理时，填本机 HTTP 或 mixed 入口，不加入住宅账号密码。需要指定出口时，填最终公网住宅 IPv4，不是中转 VPS 的地址。真实住宅凭据仍由实际承担住宅出站的 VPS 或客户端保管，检测程序不接收这些凭据。保存覆盖项后重新检测。</w:t>
+      </w:r>
+    </w:p>
+    <w:p>
+      <w:r>
+        <w:t xml:space="preserve">程序发现 Claude 后还会核对客户端身份。商店版可能有不同安装结构，识别或签名检查受限时会明确显示原因；不要改 WindowsApps 权限、移走文件或绕过校验。未安装客户端时，从 </w:t>
+      </w:r>
+      <w:r>
+        <w:fldChar w:fldCharType="begin"/>
+      </w:r>
+      <w:r>
+        <w:instrText xml:space="preserve"> HYPERLINK "https://support.claude.com/en/articles/10065433-install-claude-desktop" \h </w:instrText>
+      </w:r>
+      <w:r>
+        <w:fldChar w:fldCharType="separate"/>
       </w:r>
       <w:r>
         <w:rPr>
-          <w:rFonts w:ascii="Consolas" w:hAnsi="Consolas"/>
+          <w:color w:val="185B75"/>
+          <w:u w:val="single"/>
         </w:rPr>
-        <w:t>Claude.exe</w:t>
-      </w:r>
-      <w:r>
-        <w:t xml:space="preserve"> 文件路径。可以先在开始菜单找到 Claude，查看“打开文件所在的位置”；如果打开的是快捷方式文件夹，再查看快捷方式属性中的目标。路径要包含盘符、全部文件夹和文件名，填写时不加外层引号。没有这个入口或目标不清楚时，让 agent 只读查找安装位置，不自己猜一个路径。</w:t>
-      </w:r>
-    </w:p>
-    <w:p>
-      <w:r>
-        <w:t xml:space="preserve">商店或 MSIX 版可能安装在受保护的 </w:t>
+        <w:t>Claude 官方安装说明</w:t>
       </w:r>
       <w:r>
         <w:rPr>
-          <w:rFonts w:ascii="Consolas" w:hAnsi="Consolas"/>
+          <w:color w:val="185B75"/>
+          <w:u w:val="single"/>
         </w:rPr>
-        <w:t>WindowsApps</w:t>
-      </w:r>
-      <w:r>
-        <w:t xml:space="preserve"> 中，快捷方式也可能不是普通 exe 目标。当前工作台使用特定的文件与 Anthropic 签名校验；无法读取或识别时会拒绝启动。这不等于官方客户端是假软件。不要修改该目录权限、移走文件或关掉校验，让 agent 核对安装方式并明确报告当前兼容限制。</w:t>
-      </w:r>
-    </w:p>
-    <w:p>
-      <w:r>
-        <w:t xml:space="preserve">macOS 目前只接受标准位置的 </w:t>
-      </w:r>
-      <w:r>
-        <w:rPr>
-          <w:rFonts w:ascii="Consolas" w:hAnsi="Consolas"/>
-        </w:rPr>
-        <w:t>/Applications/Claude.app</w:t>
-      </w:r>
-      <w:r>
-        <w:t xml:space="preserve"> 或本人主目录下的 </w:t>
-      </w:r>
-      <w:r>
-        <w:rPr>
-          <w:rFonts w:ascii="Consolas" w:hAnsi="Consolas"/>
-        </w:rPr>
-        <w:t>Applications/Claude.app</w:t>
-      </w:r>
-      <w:r>
-        <w:t>，并检查签名。Linux 能运行检测面板，但本项目尚未实现经过验证的 Linux 客户端启动流程；官方是否提供 Linux 客户端，与本项目能否启动它是两回事。</w:t>
+        <w:fldChar w:fldCharType="end"/>
+      </w:r>
+      <w:r>
+        <w:t>进入；“未安装”是检测结果，不影响你先看网络项目。</w:t>
       </w:r>
     </w:p>
     <w:p>
@@ -2286,17 +2162,27 @@
         <w:pStyle w:val="4"/>
       </w:pPr>
       <w:r>
-        <w:t>第五步 保存 检测 再启动</w:t>
-      </w:r>
-    </w:p>
-    <w:p>
-      <w:r>
-        <w:t>确认住宅 IP 确实由自己购买并控制后再勾选采购声明。默认保留“要求 TUN 证据”；是否要求 UDP，按你真实使用的功能决定。没有理由时不要通过关闭要求来让按钮变绿。点击“保存设置”，再点击左侧的“启动前检测”返回检测页，点击“运行启动前检测”。</w:t>
-      </w:r>
-    </w:p>
-    <w:p>
-      <w:r>
-        <w:t>绿色“已通过”只表示对应项目取得预期样本；“需留意”是提醒；“未通过”表示发现冲突；“未验证”表示证据不够。完整 DNS 上游等项目目前就可能保持未验证。允许启动不等于所有项目都安全，详细边界见</w:t>
+        <w:t>第五步 验收后启动 网络变化就重测</w:t>
+      </w:r>
+    </w:p>
+    <w:p>
+      <w:r>
+        <w:t>在登录账号前，先按第十一章完成实际线路验收，尤其是主备出口、目标连接、DNS、UDP、IPv6 和断线行为。退出 Claude，用无账号连接演练；没有证据的部分保持未验证，不能把启动按钮可用当作全部验收完成。</w:t>
+      </w:r>
+    </w:p>
+    <w:p>
+      <w:r>
+        <w:t>关键检查满足后，点击“启动 Claude”，程序会重新检测并使用本轮识别和验证的客户端位置。打开体检程序本身不会自动打开或登录 Claude。它没有后台持续断线保护，代理掉线不会自动关闭 Claude，也不控制其他快捷方式；需要网络层保护时按验收章配置并实测。</w:t>
+      </w:r>
+    </w:p>
+    <w:p>
+      <w:r>
+        <w:t>换网络、节点或客户端设置后，直接点“重新检测”。关闭窗口会结束它自己的服务，不结束其他代理软件。求助时使用脱敏导出，不发送原始配置。完成标准是你能双击程序、看到本机实际结果、理解未验证项，并完成所需线路验收。</w:t>
+      </w:r>
+    </w:p>
+    <w:p>
+      <w:r>
+        <w:t>macOS / Linux 暂时使用源码方式，具体命令见</w:t>
       </w:r>
       <w:r>
         <w:fldChar w:fldCharType="begin"/>
@@ -2322,24 +2208,14 @@
         <w:fldChar w:fldCharType="end"/>
       </w:r>
       <w:r>
-        <w:t>。</w:t>
-      </w:r>
-    </w:p>
-    <w:p>
-      <w:r>
-        <w:t>在登录账号前，先跳到第十一章完成实际线路验收，尤其是主备出口、目标连接、DNS、UDP、IPv6 和断线后的行为。先退出 Claude，用无账号测试连接演练；关键路径失败或尚未验证时，先解决或写明限制并完成必要验证，不把“允许启动”当作配置已经验收。</w:t>
-      </w:r>
-    </w:p>
-    <w:p>
-      <w:r>
-        <w:t>完成线路验收，且本轮关键检查满足后，可以点击“启动 Claude”；程序会重新检测，不使用过期结果。它没有后台持续保护，启动后代理掉线不会自动关闭 Claude，也不阻止你从其他快捷方式打开程序。本章完成标准是你能启动面板、正确填写配置、看懂每一项结果，并已完成使用前所需的线路验收。</w:t>
+        <w:t>。Windows 源码版也保留给维护者；普通使用者优先使用便携包，不必为了检测面板安装 WSL。</w:t>
       </w:r>
     </w:p>
     <w:p>
       <w:pPr>
         <w:pStyle w:val="3"/>
       </w:pPr>
-      <w:bookmarkStart w:id="8" w:name="_Toc2537"/>
+      <w:bookmarkStart w:id="8" w:name="_Toc32424"/>
       <w:r>
         <w:t>第九章 注册 登录 付款 都走本人官方流程</w:t>
       </w:r>
@@ -2732,7 +2608,7 @@
       <w:pPr>
         <w:pStyle w:val="3"/>
       </w:pPr>
-      <w:bookmarkStart w:id="9" w:name="_Toc5687"/>
+      <w:bookmarkStart w:id="9" w:name="_Toc30190"/>
       <w:r>
         <w:t>第十章 遇到问题 按层排查 不重新折腾一遍</w:t>
       </w:r>
@@ -2782,7 +2658,7 @@
     </w:p>
     <w:p>
       <w:r>
-        <w:t>先分辨是购买订单没开通、服务器连不上、代理客户端失败、工作台无法打开，还是 Claude 登录或账单报错。比如工作台页面打不开，优先看本地服务窗口；银行卡被拒则去核对账单，不能都归因于“IP 不干净”。</w:t>
+        <w:t>先分辨是购买订单没开通、服务器连不上、代理客户端失败、体检程序无法打开，还是 Claude 登录或账单报错。比如体检程序打不开，优先看下面的解压和组件检查；银行卡被拒则去核对账单，不能都归因于“IP 不干净”。</w:t>
       </w:r>
     </w:p>
     <w:p>
@@ -2795,7 +2671,65 @@
     </w:p>
     <w:p>
       <w:r>
-        <w:t xml:space="preserve">双击脚本一闪而过，先确认 ZIP 已解压，目录内有 </w:t>
+        <w:t>Windows 便携版先确认 ZIP 已完整解压，</w:t>
+      </w:r>
+      <w:r>
+        <w:rPr>
+          <w:rFonts w:ascii="Consolas" w:hAnsi="Consolas"/>
+        </w:rPr>
+        <w:t>ClaudeNetworkGuide.exe</w:t>
+      </w:r>
+      <w:r>
+        <w:t xml:space="preserve"> 和 </w:t>
+      </w:r>
+      <w:r>
+        <w:rPr>
+          <w:rFonts w:ascii="Consolas" w:hAnsi="Consolas"/>
+        </w:rPr>
+        <w:t>_internal</w:t>
+      </w:r>
+      <w:r>
+        <w:t xml:space="preserve"> 文件夹在一起，不能只拷贝一个 exe。系统应为 Windows x64；若明确提示缺少 WebView2 或 .NET，请按</w:t>
+      </w:r>
+      <w:r>
+        <w:fldChar w:fldCharType="begin"/>
+      </w:r>
+      <w:r>
+        <w:instrText xml:space="preserve"> HYPERLINK "https://github.com/clm031102-source/claude-network-guide/blob/main/docs/desktop-app.md" \h </w:instrText>
+      </w:r>
+      <w:r>
+        <w:fldChar w:fldCharType="separate"/>
+      </w:r>
+      <w:r>
+        <w:rPr>
+          <w:color w:val="185B75"/>
+          <w:u w:val="single"/>
+        </w:rPr>
+        <w:t>程序说明</w:t>
+      </w:r>
+      <w:r>
+        <w:rPr>
+          <w:color w:val="185B75"/>
+          <w:u w:val="single"/>
+        </w:rPr>
+        <w:fldChar w:fldCharType="end"/>
+      </w:r>
+      <w:r>
+        <w:t>补齐微软官方组件，再重新打开。不需要为了启动便携版安装 Python。</w:t>
+      </w:r>
+    </w:p>
+    <w:p>
+      <w:r>
+        <w:t xml:space="preserve">只有使用源码版的人才需要检查 Python 3.10+：在项目根目录运行 </w:t>
+      </w:r>
+      <w:r>
+        <w:rPr>
+          <w:rFonts w:ascii="Consolas" w:hAnsi="Consolas"/>
+        </w:rPr>
+        <w:t>python -m app.server</w:t>
+      </w:r>
+      <w:r>
+        <w:t xml:space="preserve">，按终端实际地址打开。提示找不到 </w:t>
       </w:r>
       <w:r>
         <w:rPr>
@@ -2804,62 +2738,12 @@
         <w:t>app</w:t>
       </w:r>
       <w:r>
-        <w:t xml:space="preserve">，再检查 Python。想保留错误信息，可以在项目根目录的资源管理器地址栏输入 </w:t>
-      </w:r>
-      <w:r>
-        <w:rPr>
-          <w:rFonts w:ascii="Consolas" w:hAnsi="Consolas"/>
-        </w:rPr>
-        <w:t>powershell</w:t>
-      </w:r>
-      <w:r>
-        <w:t xml:space="preserve"> 并回车，在出现的窗口执行 </w:t>
-      </w:r>
-      <w:r>
-        <w:rPr>
-          <w:rFonts w:ascii="Consolas" w:hAnsi="Consolas"/>
-        </w:rPr>
-        <w:t>py -3 -m app.server</w:t>
-      </w:r>
-      <w:r>
-        <w:t xml:space="preserve">；如果前面只有 </w:t>
-      </w:r>
-      <w:r>
-        <w:rPr>
-          <w:rFonts w:ascii="Consolas" w:hAnsi="Consolas"/>
-        </w:rPr>
-        <w:t>python --version</w:t>
-      </w:r>
-      <w:r>
-        <w:t xml:space="preserve"> 可用，就执行 </w:t>
-      </w:r>
-      <w:r>
-        <w:rPr>
-          <w:rFonts w:ascii="Consolas" w:hAnsi="Consolas"/>
-        </w:rPr>
-        <w:t>python -m app.server</w:t>
-      </w:r>
-      <w:r>
-        <w:t xml:space="preserve">。这条命令必须在项目根目录运行；提示找不到 </w:t>
-      </w:r>
-      <w:r>
-        <w:rPr>
-          <w:rFonts w:ascii="Consolas" w:hAnsi="Consolas"/>
-        </w:rPr>
-        <w:t>app</w:t>
-      </w:r>
-      <w:r>
-        <w:t xml:space="preserve"> 时，先检查当前目录。</w:t>
-      </w:r>
-    </w:p>
-    <w:p>
-      <w:r>
-        <w:t>浏览器提示无法连接，查看服务窗口是否还在、输出的端口是不是 8765，或者已经改为 8766 等。不要因此关闭所有占端口的软件。所有候选端口都占用时，可以让 agent 查明原因，再选择端口，不去结束不认识的进程。</w:t>
-      </w:r>
-    </w:p>
-    <w:p>
-      <w:r>
-        <w:t>面板提示会话失效，按当前服务窗口地址重新打开页面。保存设置后旧报告清空是预期行为，需要重新检测；不要把清空当作检测数据丢失或账号被登出。</w:t>
+        <w:t xml:space="preserve"> 时先检查当前目录；浏览器无法连接时核对服务是否还在、端口是否已换成 8766 等，不去结束不认识的进程。</w:t>
+      </w:r>
+    </w:p>
+    <w:p>
+      <w:r>
+        <w:t>面板提示会话失效，关闭体检窗口后重新打开。保存高级设置会清空旧报告并开始新检测；不要把清空当作检测数据丢失或账号被登出。</w:t>
       </w:r>
     </w:p>
     <w:p>
@@ -2872,7 +2756,7 @@
     </w:p>
     <w:p>
       <w:r>
-        <w:t>显式代理出口不对，先查填写的端口与选中节点。默认通道和显式代理不一致，再查 TUN 是否真正接管、是否有多个代理同时运行、是否存在排除接口或不同分组。两个入口结果不同，检查是否都接入同一住宅出站。</w:t>
+        <w:t>显式代理出口不对，先查自动识别的端口与客户端选中节点；识别到另一套正在运行的代理时，才用高级设置指定正确入口。默认通道和显式代理不一致，再查 TUN 是否真正接管、是否有多个代理同时运行、是否存在排除接口或不同分组。两个入口结果不同，检查是否都接入同一住宅出站。</w:t>
       </w:r>
     </w:p>
     <w:p>
@@ -2939,7 +2823,7 @@
       <w:pPr>
         <w:pStyle w:val="3"/>
       </w:pPr>
-      <w:bookmarkStart w:id="10" w:name="_Toc20140"/>
+      <w:bookmarkStart w:id="10" w:name="_Toc14507"/>
       <w:r>
         <w:t>第十一章 怎样验收 怎样向别人求助</w:t>
       </w:r>
@@ -3118,7 +3002,7 @@
       <w:pPr>
         <w:pStyle w:val="3"/>
       </w:pPr>
-      <w:bookmarkStart w:id="11" w:name="_Toc16092"/>
+      <w:bookmarkStart w:id="11" w:name="_Toc7291"/>
       <w:r>
         <w:t>第十二章 让你信任的 agent 手把手带做</w:t>
       </w:r>
@@ -3270,7 +3154,7 @@
         <w:pStyle w:val="168"/>
       </w:pPr>
       <w:r>
-        <w:t>一次问清必要信息：①电脑系统与版本；②是否已有 VPS、系统及其他业务，是否已自行购买固定独享住宅/ISP 出口，其协议和 UDP 支持情况；③当前代理客户端与监听端口；④是否已安装官方 Claude；⑤现在卡在哪一步；⑥本次允许操作的具体电脑/服务器，以及进度记录应保存的本地文件位置。已有答案不要重问；我不知道的内容，先教我在哪里查看，不索取密码。公开聊天只用脱敏信息，真实地址和凭据由本人放在私有配置中。</w:t>
+        <w:t>先读取可用的本机检测结果，系统版本、代理客户端与端口、Claude 安装位置由程序自动识别，不要求我先解释电脑配置。只问仍缺少的必要信息：是否已有 VPS 及其他业务、是否已自行购买固定独享住宅/ISP 出口及其 UDP 支持情况、现在卡在哪一步、本次允许操作的具体电脑/服务器和本地进度文件位置。无法访问我的电脑时，先带我打开本地程序取得结果。已有答案不要重问，不索取密码；公开聊天只用脱敏信息，真实地址和凭据由本人放在私有配置中。</w:t>
       </w:r>
     </w:p>
     <w:p>
@@ -3335,7 +3219,7 @@
         <w:pStyle w:val="168"/>
       </w:pPr>
       <w:r>
-        <w:t>本地工作台需要 Python 3.10+。Windows 用仓库根目录“启动检测.cmd”，其他系统按当前 README。只监听 127.0.0.1；默认从 8765 顺序尝试至 8774，按终端实际地址打开。填写最终住宅公网 IPv4、实际本地 HTTP/mixed 代理入口及官方 Claude 完整路径；代理 URL 不带账号密码，住宅凭据由实际承担住宅出站的 VPS 或客户端保管，工作台不接收。采购声明必须真实，不替我勾选未确认事项。</w:t>
+        <w:t>Windows 优先下载本仓库 Releases 的 ClaudeNetworkGuide-Windows-x64.zip，完整解压后双击 ClaudeNetworkGuide.exe，无需安装 Python。打开独立窗口会自动只读识别系统代理、客户端端口、TUN/路由/DNS和Claude安装位置并实际检测；不要先让我填住宅IP、端口或路径问卷，也不要用采购声明当检测门槛。先依据自动识别结果继续，只有确有需要时才用高级设置覆盖。出口未指定时检查实测样本与通道一致性，不把它当住宅采购认证。住宅凭据由实际承担住宅出站的VPS或客户端保管，体检程序不接收。macOS/Linux与源码运行按当前README。</w:t>
       </w:r>
     </w:p>
     <w:p>
@@ -3348,7 +3232,7 @@
         <w:pStyle w:val="168"/>
       </w:pPr>
       <w:r>
-        <w:t>先在未登录 Claude 的状态下完成下段要求的主备线路与断线验收，再引导我主动运行检测，逐项解释 pass、warning、fail、unknown。双服务的显式代理出口与默认 TCP 出口都须匹配预期；当前 TUN、目标 TLS 可达性、客户端签名等以源码门禁为准。fake-IP 不能证明上游 DNS；STUN 部分/无响应和 IPv6 超时不得写成无泄漏；ASN 不认证住宅。关键项未过不能启动，也不能改报告或降低要求来制造全绿。满足门禁后，按我要求使用“启动 Claude”，它会重新检测；这不代表账号可用，也不控制已经运行的客户端。启动后再核对代理内核里 Claude 实际连接的规则和节点。</w:t>
+        <w:t>程序打开后自动检测，逐项解释 pass、warning、fail、unknown。未指定预期 IP 时比较双服务的显式代理出口与默认 TCP 出口是否一致；已指定时再与该地址核对。当前 TUN、目标 TLS 可达性、客户端签名等以源码门禁为准。fake-IP 不能证明上游 DNS；STUN 部分/无响应和 IPv6 超时不得写成无泄漏；ASN 不认证住宅。登录前完成下段要求的主备线路与断线验收，恢复网络后重新检测。关键项未过不能启动，也不能改报告来制造全绿。满足门禁后，按我要求使用“启动 Claude”，它会重新检测；这不代表账号可用，也不控制已经运行的客户端。启动后再核对代理内核里 Claude 实际连接的规则和节点。</w:t>
       </w:r>
     </w:p>
     <w:p>
@@ -3797,7 +3681,7 @@
     <w:lsdException w:uiPriority="99" w:name="footnote text"/>
     <w:lsdException w:uiPriority="99" w:name="annotation text"/>
     <w:lsdException w:uiPriority="99" w:semiHidden="0" w:name="header"/>
-    <w:lsdException w:qFormat="1" w:uiPriority="99" w:semiHidden="0" w:name="footer"/>
+    <w:lsdException w:uiPriority="99" w:semiHidden="0" w:name="footer"/>
     <w:lsdException w:uiPriority="99" w:name="index heading"/>
     <w:lsdException w:qFormat="1" w:uiPriority="35" w:name="caption"/>
     <w:lsdException w:uiPriority="99" w:name="table of figures"/>
@@ -3830,7 +3714,7 @@
     <w:lsdException w:qFormat="1" w:unhideWhenUsed="0" w:uiPriority="10" w:semiHidden="0" w:name="Title"/>
     <w:lsdException w:uiPriority="99" w:name="Closing"/>
     <w:lsdException w:uiPriority="99" w:name="Signature"/>
-    <w:lsdException w:qFormat="1" w:uiPriority="1" w:name="Default Paragraph Font"/>
+    <w:lsdException w:uiPriority="1" w:name="Default Paragraph Font"/>
     <w:lsdException w:uiPriority="99" w:semiHidden="0" w:name="Body Text"/>
     <w:lsdException w:uiPriority="99" w:name="Body Text Indent"/>
     <w:lsdException w:uiPriority="99" w:semiHidden="0" w:name="List Continue"/>
@@ -3868,7 +3752,7 @@
     <w:lsdException w:uiPriority="99" w:name="HTML Sample"/>
     <w:lsdException w:uiPriority="99" w:name="HTML Typewriter"/>
     <w:lsdException w:uiPriority="99" w:name="HTML Variable"/>
-    <w:lsdException w:qFormat="1" w:uiPriority="99" w:name="Normal Table"/>
+    <w:lsdException w:uiPriority="99" w:name="Normal Table"/>
     <w:lsdException w:uiPriority="99" w:name="annotation subject"/>
     <w:lsdException w:uiPriority="99" w:name="Table Simple 1"/>
     <w:lsdException w:uiPriority="99" w:name="Table Simple 2"/>
@@ -4275,14 +4159,12 @@
     <w:name w:val="Default Paragraph Font"/>
     <w:semiHidden/>
     <w:unhideWhenUsed/>
-    <w:qFormat/>
     <w:uiPriority w:val="1"/>
   </w:style>
   <w:style w:type="table" w:default="1" w:styleId="33">
     <w:name w:val="Normal Table"/>
     <w:semiHidden/>
     <w:unhideWhenUsed/>
-    <w:qFormat/>
     <w:uiPriority w:val="99"/>
     <w:tblPr>
       <w:tblCellMar>
@@ -4479,7 +4361,6 @@
     <w:basedOn w:val="1"/>
     <w:link w:val="137"/>
     <w:unhideWhenUsed/>
-    <w:qFormat/>
     <w:uiPriority w:val="99"/>
     <w:pPr>
       <w:tabs>
@@ -16053,7 +15934,6 @@
     <w:name w:val="Header Char"/>
     <w:basedOn w:val="133"/>
     <w:link w:val="25"/>
-    <w:qFormat/>
     <w:uiPriority w:val="99"/>
   </w:style>
   <w:style w:type="character" w:customStyle="1" w:styleId="137">

</xml_diff>